<commit_message>
@ docs: regenerate CN/EN Word reports and add architecture draw.io diagrams
- Regenerate Chinese Word doc (59.0 KB) with v2.3 changes: tiered LLM config,
  v6 prompt rewrite, end-to-end RL workflow section (Step 1–8 table + data flow),
  updated response_format removal notes
- Regenerate English Word doc (61.9 KB) with same content in English
- Add docs/architecture_multiagent.drawio: 4-stage 8-agent pipeline diagram
- Add docs/architecture_rl.drawio: RL orchestration system diagram (Steps 1–8,
  Q-table, reward components, policy layer, repair hint loop, pre-bake export)

Co-Authored-By: Claude Sonnet 4.6 <noreply@anthropic.com>
@
</commit_message>
<xml_diff>
--- a/MultiAgent_Architecture_Report.docx
+++ b/MultiAgent_Architecture_Report.docx
@@ -210,6 +210,17 @@
         <w:rPr>
           <w:sz w:val="21"/>
         </w:rPr>
+        <w:t xml:space="preserve">   4.0 端到端RL工作流程 (End-to-End RL Workflow)</w:t>
+      </w:r>
+    </w:p>
+    <w:p>
+      <w:pPr>
+        <w:spacing w:after="40"/>
+      </w:pPr>
+      <w:r>
+        <w:rPr>
+          <w:sz w:val="21"/>
+        </w:rPr>
         <w:t xml:space="preserve">   4.1 Per-Agent奖励分解 (Reward Decomposition)</w:t>
       </w:r>
     </w:p>
@@ -243,7 +254,7 @@
         <w:rPr>
           <w:sz w:val="21"/>
         </w:rPr>
-        <w:t xml:space="preserve">   4.4 确定性Prompt工程 — arXiv 2603.07728 (NEW v2.3)</w:t>
+        <w:t xml:space="preserve">   4.4 GRPO数据采集</w:t>
       </w:r>
     </w:p>
     <w:p>
@@ -254,7 +265,18 @@
         <w:rPr>
           <w:sz w:val="21"/>
         </w:rPr>
-        <w:t xml:space="preserve">   4.5 结构化JSON输出与API可靠性 (NEW v2.3)</w:t>
+        <w:t xml:space="preserve">   4.5 确定性Prompt工程 v6 — arXiv 2603.07728 (NEW v2.3)</w:t>
+      </w:r>
+    </w:p>
+    <w:p>
+      <w:pPr>
+        <w:spacing w:after="40"/>
+      </w:pPr>
+      <w:r>
+        <w:rPr>
+          <w:sz w:val="21"/>
+        </w:rPr>
+        <w:t xml:space="preserve">   4.6 结构化JSON输出与API可靠性 (NEW v2.3)</w:t>
       </w:r>
     </w:p>
     <w:p>
@@ -6447,6 +6469,464 @@
         <w:pStyle w:val="Heading2"/>
       </w:pPr>
       <w:r>
+        <w:t>4.0 端到端RL工作流程 (End-to-End RL Workflow)</w:t>
+      </w:r>
+    </w:p>
+    <w:p>
+      <w:r>
+        <w:t>以下描述了单次管线运行在RL系统中的完整生命周期，从提交Prompt到更新Q值：</w:t>
+      </w:r>
+    </w:p>
+    <w:tbl>
+      <w:tblPr>
+        <w:tblStyle w:val="LightGrid-Accent1"/>
+        <w:tblW w:type="auto" w:w="0"/>
+        <w:jc w:val="center"/>
+        <w:tblLook w:firstColumn="1" w:firstRow="1" w:lastColumn="0" w:lastRow="0" w:noHBand="0" w:noVBand="1" w:val="04A0"/>
+      </w:tblPr>
+      <w:tblGrid>
+        <w:gridCol w:w="2880"/>
+        <w:gridCol w:w="2880"/>
+        <w:gridCol w:w="2880"/>
+      </w:tblGrid>
+      <w:tr>
+        <w:tc>
+          <w:tcPr>
+            <w:tcW w:type="dxa" w:w="2880"/>
+          </w:tcPr>
+          <w:p>
+            <w:r>
+              <w:rPr>
+                <w:b/>
+                <w:sz w:val="18"/>
+              </w:rPr>
+              <w:t>步骤</w:t>
+            </w:r>
+          </w:p>
+        </w:tc>
+        <w:tc>
+          <w:tcPr>
+            <w:tcW w:type="dxa" w:w="2880"/>
+          </w:tcPr>
+          <w:p>
+            <w:r>
+              <w:rPr>
+                <w:b/>
+                <w:sz w:val="18"/>
+              </w:rPr>
+              <w:t>组件</w:t>
+            </w:r>
+          </w:p>
+        </w:tc>
+        <w:tc>
+          <w:tcPr>
+            <w:tcW w:type="dxa" w:w="2880"/>
+          </w:tcPr>
+          <w:p>
+            <w:r>
+              <w:rPr>
+                <w:b/>
+                <w:sz w:val="18"/>
+              </w:rPr>
+              <w:t>动作</w:t>
+            </w:r>
+          </w:p>
+        </w:tc>
+      </w:tr>
+      <w:tr>
+        <w:tc>
+          <w:tcPr>
+            <w:tcW w:type="dxa" w:w="2880"/>
+          </w:tcPr>
+          <w:p>
+            <w:r>
+              <w:rPr>
+                <w:sz w:val="18"/>
+              </w:rPr>
+              <w:t>1. 变体选择</w:t>
+            </w:r>
+          </w:p>
+        </w:tc>
+        <w:tc>
+          <w:tcPr>
+            <w:tcW w:type="dxa" w:w="2880"/>
+          </w:tcPr>
+          <w:p>
+            <w:r>
+              <w:rPr>
+                <w:sz w:val="18"/>
+              </w:rPr>
+              <w:t>MultiAgentOptimizer</w:t>
+            </w:r>
+          </w:p>
+        </w:tc>
+        <w:tc>
+          <w:tcPr>
+            <w:tcW w:type="dxa" w:w="2880"/>
+          </w:tcPr>
+          <w:p>
+            <w:r>
+              <w:rPr>
+                <w:sz w:val="18"/>
+              </w:rPr>
+              <w:t>每次管线运行前，Bandit为每个Agent用ε-greedy策略选择Prompt变体：90%选Q值最高的变体（利用），10%随机探索。变体ID记录到_variant_tracker。</w:t>
+            </w:r>
+          </w:p>
+        </w:tc>
+      </w:tr>
+      <w:tr>
+        <w:tc>
+          <w:tcPr>
+            <w:tcW w:type="dxa" w:w="2880"/>
+          </w:tcPr>
+          <w:p>
+            <w:r>
+              <w:rPr>
+                <w:sz w:val="18"/>
+              </w:rPr>
+              <w:t>2. 管线执行</w:t>
+            </w:r>
+          </w:p>
+        </w:tc>
+        <w:tc>
+          <w:tcPr>
+            <w:tcW w:type="dxa" w:w="2880"/>
+          </w:tcPr>
+          <w:p>
+            <w:r>
+              <w:rPr>
+                <w:sz w:val="18"/>
+              </w:rPr>
+              <w:t>StructuralModelingPipeline</w:t>
+            </w:r>
+          </w:p>
+        </w:tc>
+        <w:tc>
+          <w:tcPr>
+            <w:tcW w:type="dxa" w:w="2880"/>
+          </w:tcPr>
+          <w:p>
+            <w:r>
+              <w:rPr>
+                <w:sz w:val="18"/>
+              </w:rPr>
+              <w:t>管线使用选定的变体运行。每个Agent使用其选定的Prompt模板。检查点验证器在每个阶段收集结构化错误列表。</w:t>
+            </w:r>
+          </w:p>
+        </w:tc>
+      </w:tr>
+      <w:tr>
+        <w:tc>
+          <w:tcPr>
+            <w:tcW w:type="dxa" w:w="2880"/>
+          </w:tcPr>
+          <w:p>
+            <w:r>
+              <w:rPr>
+                <w:sz w:val="18"/>
+              </w:rPr>
+              <w:t>3. 奖励计算</w:t>
+            </w:r>
+          </w:p>
+        </w:tc>
+        <w:tc>
+          <w:tcPr>
+            <w:tcW w:type="dxa" w:w="2880"/>
+          </w:tcPr>
+          <w:p>
+            <w:r>
+              <w:rPr>
+                <w:sz w:val="18"/>
+              </w:rPr>
+              <w:t>AgentRewardDecomposer</w:t>
+            </w:r>
+          </w:p>
+        </w:tc>
+        <w:tc>
+          <w:tcPr>
+            <w:tcW w:type="dxa" w:w="2880"/>
+          </w:tcPr>
+          <w:p>
+            <w:r>
+              <w:rPr>
+                <w:sz w:val="18"/>
+              </w:rPr>
+              <w:t>管线完成（或失败）后，根据（a）检查点错误、（b）执行状态、（c）人工反馈，为每个Agent计算奖励，总分范围[0,1]。</w:t>
+            </w:r>
+          </w:p>
+        </w:tc>
+      </w:tr>
+      <w:tr>
+        <w:tc>
+          <w:tcPr>
+            <w:tcW w:type="dxa" w:w="2880"/>
+          </w:tcPr>
+          <w:p>
+            <w:r>
+              <w:rPr>
+                <w:sz w:val="18"/>
+              </w:rPr>
+              <w:t>4. 经验记录</w:t>
+            </w:r>
+          </w:p>
+        </w:tc>
+        <w:tc>
+          <w:tcPr>
+            <w:tcW w:type="dxa" w:w="2880"/>
+          </w:tcPr>
+          <w:p>
+            <w:r>
+              <w:rPr>
+                <w:sz w:val="18"/>
+              </w:rPr>
+              <w:t>ExperienceBuffer</w:t>
+            </w:r>
+          </w:p>
+        </w:tc>
+        <w:tc>
+          <w:tcPr>
+            <w:tcW w:type="dxa" w:w="2880"/>
+          </w:tcPr>
+          <w:p>
+            <w:r>
+              <w:rPr>
+                <w:sz w:val="18"/>
+              </w:rPr>
+              <w:t>将每个Agent的（变体、input_signature、reward、llm_input、llm_output）写入SQLite的agent_experiences表。每个Agent最多保留200条环形缓冲记录。</w:t>
+            </w:r>
+          </w:p>
+        </w:tc>
+      </w:tr>
+      <w:tr>
+        <w:tc>
+          <w:tcPr>
+            <w:tcW w:type="dxa" w:w="2880"/>
+          </w:tcPr>
+          <w:p>
+            <w:r>
+              <w:rPr>
+                <w:sz w:val="18"/>
+              </w:rPr>
+              <w:t>5. Q值更新</w:t>
+            </w:r>
+          </w:p>
+        </w:tc>
+        <w:tc>
+          <w:tcPr>
+            <w:tcW w:type="dxa" w:w="2880"/>
+          </w:tcPr>
+          <w:p>
+            <w:r>
+              <w:rPr>
+                <w:sz w:val="18"/>
+              </w:rPr>
+              <w:t>PerAgentBanditOptimizer</w:t>
+            </w:r>
+          </w:p>
+        </w:tc>
+        <w:tc>
+          <w:tcPr>
+            <w:tcW w:type="dxa" w:w="2880"/>
+          </w:tcPr>
+          <w:p>
+            <w:r>
+              <w:rPr>
+                <w:sz w:val="18"/>
+              </w:rPr>
+              <w:t>Bandit更新选定变体的Q值：Q_new = (1-α) × Q_old + α × reward，α默认0.1。更新后的Q值影响后续变体选择。</w:t>
+            </w:r>
+          </w:p>
+        </w:tc>
+      </w:tr>
+      <w:tr>
+        <w:tc>
+          <w:tcPr>
+            <w:tcW w:type="dxa" w:w="2880"/>
+          </w:tcPr>
+          <w:p>
+            <w:r>
+              <w:rPr>
+                <w:sz w:val="18"/>
+              </w:rPr>
+              <w:t>6. 修复提示生成</w:t>
+            </w:r>
+          </w:p>
+        </w:tc>
+        <w:tc>
+          <w:tcPr>
+            <w:tcW w:type="dxa" w:w="2880"/>
+          </w:tcPr>
+          <w:p>
+            <w:r>
+              <w:rPr>
+                <w:sz w:val="18"/>
+              </w:rPr>
+              <w:t>build_repair_hint()</w:t>
+            </w:r>
+          </w:p>
+        </w:tc>
+        <w:tc>
+          <w:tcPr>
+            <w:tcW w:type="dxa" w:w="2880"/>
+          </w:tcPr>
+          <w:p>
+            <w:r>
+              <w:rPr>
+                <w:sz w:val="18"/>
+              </w:rPr>
+              <w:t>若检查点失败，从错误列表生成结构化修复提示，注入到下次重试的Prompt中。针对性提示会路由到具体的失败Agent。</w:t>
+            </w:r>
+          </w:p>
+        </w:tc>
+      </w:tr>
+      <w:tr>
+        <w:tc>
+          <w:tcPr>
+            <w:tcW w:type="dxa" w:w="2880"/>
+          </w:tcPr>
+          <w:p>
+            <w:r>
+              <w:rPr>
+                <w:sz w:val="18"/>
+              </w:rPr>
+              <w:t>7. 重试（如需要）</w:t>
+            </w:r>
+          </w:p>
+        </w:tc>
+        <w:tc>
+          <w:tcPr>
+            <w:tcW w:type="dxa" w:w="2880"/>
+          </w:tcPr>
+          <w:p>
+            <w:r>
+              <w:rPr>
+                <w:sz w:val="18"/>
+              </w:rPr>
+              <w:t>管线重试循环</w:t>
+            </w:r>
+          </w:p>
+        </w:tc>
+        <w:tc>
+          <w:tcPr>
+            <w:tcW w:type="dxa" w:w="2880"/>
+          </w:tcPr>
+          <w:p>
+            <w:r>
+              <w:rPr>
+                <w:sz w:val="18"/>
+              </w:rPr>
+              <w:t>每个阶段最多重试max_retries次。每次重试在Prompt末尾附加修复提示。Bandit为每次重试选择（可能不同的）变体。</w:t>
+            </w:r>
+          </w:p>
+        </w:tc>
+      </w:tr>
+      <w:tr>
+        <w:tc>
+          <w:tcPr>
+            <w:tcW w:type="dxa" w:w="2880"/>
+          </w:tcPr>
+          <w:p>
+            <w:r>
+              <w:rPr>
+                <w:sz w:val="18"/>
+              </w:rPr>
+              <w:t>8. 预烘焙导出</w:t>
+            </w:r>
+          </w:p>
+        </w:tc>
+        <w:tc>
+          <w:tcPr>
+            <w:tcW w:type="dxa" w:w="2880"/>
+          </w:tcPr>
+          <w:p>
+            <w:r>
+              <w:rPr>
+                <w:sz w:val="18"/>
+              </w:rPr>
+              <w:t>scripts/extract_presets.py</w:t>
+            </w:r>
+          </w:p>
+        </w:tc>
+        <w:tc>
+          <w:tcPr>
+            <w:tcW w:type="dxa" w:w="2880"/>
+          </w:tcPr>
+          <w:p>
+            <w:r>
+              <w:rPr>
+                <w:sz w:val="18"/>
+              </w:rPr>
+              <w:t>运营方定期运行extract_presets.py，将累积的Q值和Few-shot示例提炼到presets/q_values.json，用于部署热启动。</w:t>
+            </w:r>
+          </w:p>
+        </w:tc>
+      </w:tr>
+    </w:tbl>
+    <w:p>
+      <w:r>
+        <w:rPr>
+          <w:b/>
+        </w:rPr>
+        <w:t>RL系统核心数据流：</w:t>
+      </w:r>
+    </w:p>
+    <w:p>
+      <w:pPr>
+        <w:spacing w:before="80" w:after="80"/>
+      </w:pPr>
+      <w:r>
+        <w:rPr>
+          <w:rFonts w:ascii="Consolas" w:hAnsi="Consolas"/>
+          <w:sz w:val="18"/>
+        </w:rPr>
+        <w:t>用户输入</w:t>
+        <w:br/>
+        <w:t xml:space="preserve">    ↓</w:t>
+        <w:br/>
+        <w:t>Bandit选择变体（基于Q值的ε-greedy）</w:t>
+        <w:br/>
+        <w:t xml:space="preserve">    ↓</w:t>
+        <w:br/>
+        <w:t>Agent使用选定的变体Prompt执行</w:t>
+        <w:br/>
+        <w:t xml:space="preserve">    ↓</w:t>
+        <w:br/>
+        <w:t>检查点验证器 → 错误列表</w:t>
+        <w:br/>
+        <w:t xml:space="preserve">    ↓                        ↓</w:t>
+        <w:br/>
+        <w:t>奖励分解器                修复提示构建器</w:t>
+        <w:br/>
+        <w:t xml:space="preserve">    ↓                        ↓</w:t>
+        <w:br/>
+        <w:t>per-agent奖励              针对性修复Prompt</w:t>
+        <w:br/>
+        <w:t xml:space="preserve">    ↓                        ↓</w:t>
+        <w:br/>
+        <w:t>经验缓冲区                  重试（如需要）</w:t>
+        <w:br/>
+        <w:t xml:space="preserve">    ↓</w:t>
+        <w:br/>
+        <w:t>Q值更新：Q_new = (1-α)×Q_old + α×reward</w:t>
+        <w:br/>
+        <w:t xml:space="preserve">    ↓</w:t>
+        <w:br/>
+        <w:t>下次运行使用更新后的Q值</w:t>
+      </w:r>
+    </w:p>
+    <w:p>
+      <w:r>
+        <w:rPr>
+          <w:i/>
+        </w:rPr>
+        <w:t>RL系统完全在Prompt和编排层面运作——不修改LLM权重。改进来自两个方面：（1）学习哪些Prompt模板对哪类结构框架最有效（通过input_signature捕获）；（2）从累积的错误模式中生成更精准的修复提示。</w:t>
+      </w:r>
+    </w:p>
+    <w:p>
+      <w:pPr>
+        <w:pStyle w:val="Heading2"/>
+      </w:pPr>
+      <w:r>
         <w:t>4.1 Per-Agent奖励分解 (Reward Decomposition)</w:t>
       </w:r>
     </w:p>
@@ -7082,14 +7562,280 @@
         <w:pStyle w:val="Heading2"/>
       </w:pPr>
       <w:r>
-        <w:t>4.5 确定性Prompt工程 — arXiv 2603.07728 [NEW in v2.3]</w:t>
+        <w:t>4.5 确定性Prompt工程 v6 — arXiv 2603.07728 [NEW in v2.3]</w:t>
       </w:r>
     </w:p>
     <w:p>
       <w:r>
-        <w:t>核心三个Agent（Construction Planning、Node Agent、Element Agent）的Prompt 已升级为基于arXiv:2603.07728论文方法的确定性工程Prompt。新Prompt以计算优先（computation-first）的设计取代了早期的启发式提示，从根本上保证结构建模的正确性。</w:t>
+        <w:t>四个建模Agent已全部重写为v6确定性Prompt，基于arXiv:2603.07728论文的逐Bay逐层施工方法。核心改变是：单元生成改用封闭公式驱动，而不是读取施工计划中预先计算的节点ID，从根本上消除重复单元和对角梁问题。</w:t>
       </w:r>
     </w:p>
+    <w:p>
+      <w:pPr>
+        <w:pStyle w:val="Heading3"/>
+      </w:pPr>
+      <w:r>
+        <w:t>以往版本失败的根本原因</w:t>
+      </w:r>
+    </w:p>
+    <w:p>
+      <w:r>
+        <w:t>v5及更早版本中导致错误建模的三个Bug：</w:t>
+      </w:r>
+    </w:p>
+    <w:p>
+      <w:pPr>
+        <w:pStyle w:val="ListBullet"/>
+      </w:pPr>
+      <w:r>
+        <w:t>问题分析Prompt没有要求输出per_bay_story_counts——下游Agent没有各Bay的层数信息。</w:t>
+      </w:r>
+    </w:p>
+    <w:p>
+      <w:pPr>
+        <w:pStyle w:val="ListBullet"/>
+      </w:pPr>
+      <w:r>
+        <w:t>施工计划为共享的column line生成了重复的column步骤（Bay 1的右边缘 = Bay 2的左边缘，被记录两次）。</w:t>
+      </w:r>
+    </w:p>
+    <w:p>
+      <w:pPr>
+        <w:pStyle w:val="ListBullet"/>
+      </w:pPr>
+      <w:r>
+        <w:t>Element Agent直接读取施工计划中的expected_node_i/j——上游任何错误都会直接产生错误的或对角线的单元。</w:t>
+      </w:r>
+    </w:p>
+    <w:p>
+      <w:pPr>
+        <w:pStyle w:val="Heading3"/>
+      </w:pPr>
+      <w:r>
+        <w:t>V6架构：三层几何管线</w:t>
+      </w:r>
+    </w:p>
+    <w:tbl>
+      <w:tblPr>
+        <w:tblStyle w:val="LightGrid-Accent1"/>
+        <w:tblW w:type="auto" w:w="0"/>
+        <w:jc w:val="center"/>
+        <w:tblLook w:firstColumn="1" w:firstRow="1" w:lastColumn="0" w:lastRow="0" w:noHBand="0" w:noVBand="1" w:val="04A0"/>
+      </w:tblPr>
+      <w:tblGrid>
+        <w:gridCol w:w="2880"/>
+        <w:gridCol w:w="2880"/>
+        <w:gridCol w:w="2880"/>
+      </w:tblGrid>
+      <w:tr>
+        <w:tc>
+          <w:tcPr>
+            <w:tcW w:type="dxa" w:w="2880"/>
+          </w:tcPr>
+          <w:p>
+            <w:r>
+              <w:rPr>
+                <w:b/>
+                <w:sz w:val="18"/>
+              </w:rPr>
+              <w:t>层次</w:t>
+            </w:r>
+          </w:p>
+        </w:tc>
+        <w:tc>
+          <w:tcPr>
+            <w:tcW w:type="dxa" w:w="2880"/>
+          </w:tcPr>
+          <w:p>
+            <w:r>
+              <w:rPr>
+                <w:b/>
+                <w:sz w:val="18"/>
+              </w:rPr>
+              <w:t>Agent</w:t>
+            </w:r>
+          </w:p>
+        </w:tc>
+        <w:tc>
+          <w:tcPr>
+            <w:tcW w:type="dxa" w:w="2880"/>
+          </w:tcPr>
+          <w:p>
+            <w:r>
+              <w:rPr>
+                <w:b/>
+                <w:sz w:val="18"/>
+              </w:rPr>
+              <w:t>职责</w:t>
+            </w:r>
+          </w:p>
+        </w:tc>
+      </w:tr>
+      <w:tr>
+        <w:tc>
+          <w:tcPr>
+            <w:tcW w:type="dxa" w:w="2880"/>
+          </w:tcPr>
+          <w:p>
+            <w:r>
+              <w:rPr>
+                <w:sz w:val="18"/>
+              </w:rPr>
+              <w:t>第1层：几何信息</w:t>
+            </w:r>
+          </w:p>
+        </w:tc>
+        <w:tc>
+          <w:tcPr>
+            <w:tcW w:type="dxa" w:w="2880"/>
+          </w:tcPr>
+          <w:p>
+            <w:r>
+              <w:rPr>
+                <w:sz w:val="18"/>
+              </w:rPr>
+              <w:t>ProblemAnalysisAgent</w:t>
+            </w:r>
+          </w:p>
+        </w:tc>
+        <w:tc>
+          <w:tcPr>
+            <w:tcW w:type="dxa" w:w="2880"/>
+          </w:tcPr>
+          <w:p>
+            <w:r>
+              <w:rPr>
+                <w:sz w:val="18"/>
+              </w:rPr>
+              <w:t>提取per_bay_story_counts（每Bay一个整数的列表）、bay_widths、story_heights。列表长度必须等于bay_count。</w:t>
+            </w:r>
+          </w:p>
+        </w:tc>
+      </w:tr>
+      <w:tr>
+        <w:tc>
+          <w:tcPr>
+            <w:tcW w:type="dxa" w:w="2880"/>
+          </w:tcPr>
+          <w:p>
+            <w:r>
+              <w:rPr>
+                <w:sz w:val="18"/>
+              </w:rPr>
+              <w:t>第2层：坐标计算</w:t>
+            </w:r>
+          </w:p>
+        </w:tc>
+        <w:tc>
+          <w:tcPr>
+            <w:tcW w:type="dxa" w:w="2880"/>
+          </w:tcPr>
+          <w:p>
+            <w:r>
+              <w:rPr>
+                <w:sz w:val="18"/>
+              </w:rPr>
+              <w:t>ConstructionPlanningAgent</w:t>
+            </w:r>
+          </w:p>
+        </w:tc>
+        <w:tc>
+          <w:tcPr>
+            <w:tcW w:type="dxa" w:w="2880"/>
+          </w:tcPr>
+          <w:p>
+            <w:r>
+              <w:rPr>
+                <w:sz w:val="18"/>
+              </w:rPr>
+              <w:t>预计算column_lines_x、story_levels_y、levels_per_column、偏移量。输出纯施工序列（不含expected_node_i/j）。</w:t>
+            </w:r>
+          </w:p>
+        </w:tc>
+      </w:tr>
+      <w:tr>
+        <w:tc>
+          <w:tcPr>
+            <w:tcW w:type="dxa" w:w="2880"/>
+          </w:tcPr>
+          <w:p>
+            <w:r>
+              <w:rPr>
+                <w:sz w:val="18"/>
+              </w:rPr>
+              <w:t>第3a层：节点</w:t>
+            </w:r>
+          </w:p>
+        </w:tc>
+        <w:tc>
+          <w:tcPr>
+            <w:tcW w:type="dxa" w:w="2880"/>
+          </w:tcPr>
+          <w:p>
+            <w:r>
+              <w:rPr>
+                <w:sz w:val="18"/>
+              </w:rPr>
+              <w:t>NodeAgent</w:t>
+            </w:r>
+          </w:p>
+        </w:tc>
+        <w:tc>
+          <w:tcPr>
+            <w:tcW w:type="dxa" w:w="2880"/>
+          </w:tcPr>
+          <w:p>
+            <w:r>
+              <w:rPr>
+                <w:sz w:val="18"/>
+              </w:rPr>
+              <w:t>按列逐层生成节点，使用公式node_id(c,s)=offset[c]+s+1。所有底部节点(s=0)为固定支座。</w:t>
+            </w:r>
+          </w:p>
+        </w:tc>
+      </w:tr>
+      <w:tr>
+        <w:tc>
+          <w:tcPr>
+            <w:tcW w:type="dxa" w:w="2880"/>
+          </w:tcPr>
+          <w:p>
+            <w:r>
+              <w:rPr>
+                <w:sz w:val="18"/>
+              </w:rPr>
+              <w:t>第3b层：单元</w:t>
+            </w:r>
+          </w:p>
+        </w:tc>
+        <w:tc>
+          <w:tcPr>
+            <w:tcW w:type="dxa" w:w="2880"/>
+          </w:tcPr>
+          <w:p>
+            <w:r>
+              <w:rPr>
+                <w:sz w:val="18"/>
+              </w:rPr>
+              <w:t>ElementAgent</w:t>
+            </w:r>
+          </w:p>
+        </w:tc>
+        <w:tc>
+          <w:tcPr>
+            <w:tcW w:type="dxa" w:w="2880"/>
+          </w:tcPr>
+          <w:p>
+            <w:r>
+              <w:rPr>
+                <w:sz w:val="18"/>
+              </w:rPr>
+              <w:t>使用独立公式生成单元——不读取施工计划ID。</w:t>
+            </w:r>
+          </w:p>
+        </w:tc>
+      </w:tr>
+    </w:tbl>
     <w:p>
       <w:pPr>
         <w:pStyle w:val="Heading3"/>
@@ -7127,12 +7873,76 @@
         <w:pStyle w:val="Heading3"/>
       </w:pPr>
       <w:r>
-        <w:t>逐Bay逐层构建</w:t>
+        <w:t>V6单元生成公式</w:t>
       </w:r>
     </w:p>
     <w:p>
       <w:r>
-        <w:t>Construction Plan充当中央协调器，预计算column_lines_x、story_levels_y、levels_per_column、per_bay_story_counts以及每个施工步骤的expected_node_i/j。Node Agent和Element Agent直接使用这些预计算值，消除了Agent间的歧义。</w:t>
+        <w:t>单元生成完全独立于施工计划，分两轮完成：</w:t>
+      </w:r>
+    </w:p>
+    <w:p>
+      <w:r>
+        <w:rPr>
+          <w:b/>
+        </w:rPr>
+        <w:t>第1轮 — 所有柱（Column）：</w:t>
+      </w:r>
+    </w:p>
+    <w:p>
+      <w:pPr>
+        <w:spacing w:before="80" w:after="80"/>
+      </w:pPr>
+      <w:r>
+        <w:rPr>
+          <w:rFonts w:ascii="Consolas" w:hAnsi="Consolas"/>
+          <w:sz w:val="18"/>
+        </w:rPr>
+        <w:t>for c in range(bay_count + 1):          # 每条column line</w:t>
+        <w:br/>
+        <w:t xml:space="preserve">    for s in range(1, levels_per_column[c]):</w:t>
+        <w:br/>
+        <w:t xml:space="preserve">        column(node_id(c, s-1), node_id(c, s))  # 垂直：相同x，y递增</w:t>
+        <w:br/>
+        <w:br/>
+        <w:t>总柱数 = sum(levels_per_column[c] - 1)，无重复</w:t>
+      </w:r>
+    </w:p>
+    <w:p>
+      <w:r>
+        <w:rPr>
+          <w:b/>
+        </w:rPr>
+        <w:t>第2轮 — 所有梁（Girder）：</w:t>
+      </w:r>
+    </w:p>
+    <w:p>
+      <w:pPr>
+        <w:spacing w:before="80" w:after="80"/>
+      </w:pPr>
+      <w:r>
+        <w:rPr>
+          <w:rFonts w:ascii="Consolas" w:hAnsi="Consolas"/>
+          <w:sz w:val="18"/>
+        </w:rPr>
+        <w:t>for b in range(1, bay_count + 1):       # 每个Bay</w:t>
+        <w:br/>
+        <w:t xml:space="preserve">    left_col = b - 1</w:t>
+        <w:br/>
+        <w:t xml:space="preserve">    right_col = b</w:t>
+        <w:br/>
+        <w:t xml:space="preserve">    for s in range(1, per_bay_story_counts[b-1] + 1):</w:t>
+        <w:br/>
+        <w:t xml:space="preserve">        # 门控检查（三项必须全部通过）：</w:t>
+        <w:br/>
+        <w:t xml:space="preserve">        #   levels_per_column[left_col] &gt; s</w:t>
+        <w:br/>
+        <w:t xml:space="preserve">        #   levels_per_column[right_col] &gt; s</w:t>
+        <w:br/>
+        <w:t xml:space="preserve">        girder(node_id(left_col, s), node_id(right_col, s))  # 水平：相同y</w:t>
+        <w:br/>
+        <w:br/>
+        <w:t>总梁数 = sum(per_bay_story_counts)，每条梁严格水平</w:t>
       </w:r>
     </w:p>
     <w:p>
@@ -7140,12 +7950,7 @@
         <w:pStyle w:val="Heading3"/>
       </w:pPr>
       <w:r>
-        <w:t>四门Girder验证</w:t>
-      </w:r>
-    </w:p>
-    <w:p>
-      <w:r>
-        <w:t>对于非均匀Bay框架（相邻Bay有不同层数），系统在创建任何Girder元素之前强制执行四道验证门：</w:t>
+        <w:t>V6保证的不变量</w:t>
       </w:r>
     </w:p>
     <w:p>
@@ -7153,7 +7958,7 @@
         <w:pStyle w:val="ListBullet"/>
       </w:pPr>
       <w:r>
-        <w:t>门1 (Bay容量): Story_number &lt;= per_bay_story_counts[Bay_number - 1]</w:t>
+        <w:t>零对角单元：每个柱的Δx=0（垂直），每个梁的Δy=0（水平）</w:t>
       </w:r>
     </w:p>
     <w:p>
@@ -7161,7 +7966,7 @@
         <w:pStyle w:val="ListBullet"/>
       </w:pPr>
       <w:r>
-        <w:t>门2 (左锚点): levels_per_column[col_left - 1] &gt; Story_number</w:t>
+        <w:t>零重复单元：柱对每条column line只迭代一次，梁对每个Bay-Story对只迭代一次</w:t>
       </w:r>
     </w:p>
     <w:p>
@@ -7169,7 +7974,7 @@
         <w:pStyle w:val="ListBullet"/>
       </w:pPr>
       <w:r>
-        <w:t>门3 (右锚点): levels_per_column[col_right - 1] &gt; Story_number</w:t>
+        <w:t>正确的阶梯框架：per_bay_story_counts[b-1]限制每个Bay的梁生成范围，较矮的Bay在其顶部以上不会产生梁</w:t>
       </w:r>
     </w:p>
     <w:p>
@@ -7177,12 +7982,7 @@
         <w:pStyle w:val="ListBullet"/>
       </w:pPr>
       <w:r>
-        <w:t>门4 (水平对齐): node_i.y == node_j.y == story_levels_y[Story_number]</w:t>
-      </w:r>
-    </w:p>
-    <w:p>
-      <w:r>
-        <w:t>任何一门未通过，该Girder将被跳过。这防止了在Bay不存在的楼层高度创建Girder的常见错误。</w:t>
+        <w:t>一致的节点ID：NodeAgent和ElementAgent使用相同的offset[c]+s+1公式</w:t>
       </w:r>
     </w:p>
     <w:p>
@@ -7203,12 +8003,36 @@
         <w:pStyle w:val="Heading3"/>
       </w:pPr>
       <w:r>
-        <w:t>结构化JSON输出</w:t>
+        <w:t>结构化JSON输出（三层策略）</w:t>
       </w:r>
     </w:p>
     <w:p>
       <w:r>
-        <w:t>LLMClient.run_structured()方法现在传递response_format={"type": "json_object"}给API，约束模型只生成合法的JSON token。这消除了之前导致约15%的Agent重试的JSON解析错误。五个结构化输出Agent（ProblemAnalysis、ConstructionPlanning、NodeAgent、ElementAgent、LoadAssignment）受益于此保证。</w:t>
+        <w:t>DeepSeek的response_format={"type":"json_object"}会导致API无限挂起（已确认：76分钟挂起 + 5×300秒超时）。根本原因：DeepSeek使用拒绝采样（rejection sampling），而非原生约束解码——如果模型无法生成合法JSON，内部重试循环永不终止。该参数已移除，改用三层兜底策略：</w:t>
+      </w:r>
+    </w:p>
+    <w:p>
+      <w:pPr>
+        <w:pStyle w:val="ListBullet"/>
+      </w:pPr>
+      <w:r>
+        <w:t>第1层 — V6 Prompt工程：每个Prompt中包含明确的JSON Schema和完整示例。</w:t>
+      </w:r>
+    </w:p>
+    <w:p>
+      <w:pPr>
+        <w:pStyle w:val="ListBullet"/>
+      </w:pPr>
+      <w:r>
+        <w:t>第2层 — 正则提取：_extract_json_text()剥离Markdown围栏并从自由文本响应中提取JSON。</w:t>
+      </w:r>
+    </w:p>
+    <w:p>
+      <w:pPr>
+        <w:pStyle w:val="ListBullet"/>
+      </w:pPr>
+      <w:r>
+        <w:t>第3层 — 带修复提示的重试：若JSON解析失败，注入修复提示后重试Agent。</w:t>
       </w:r>
     </w:p>
     <w:p>
@@ -7216,12 +8040,12 @@
         <w:pStyle w:val="Heading3"/>
       </w:pPr>
       <w:r>
-        <w:t>API超时修复</w:t>
+        <w:t>API超时（硬性截止时间）</w:t>
       </w:r>
     </w:p>
     <w:p>
       <w:r>
-        <w:t>requests.post()的超时参数从单浮点数（timeout=300，仅设置每次读取超时）改为元组（timeout=(30, 600)），提供30秒连接超时和600秒读取超时。这防止了LLM API 中途停止发送数据时的无限期挂起（最坏情况曾出现单次API调用挂起72分钟）。</w:t>
+        <w:t>timeout=300（单浮点数）为整个请求设置5分钟硬性截止时间。此前曾使用元组(30, 600)允许10分钟读取超时，但DeepSeek数据发送速度过慢时仍导致76分钟挂起。单浮点数模式下5分钟是绝对上限。</w:t>
       </w:r>
     </w:p>
     <w:p>

</xml_diff>

<commit_message>
docs: add RAG knowledge base integration section (4.9 EN / 4.8 CN)
New section covers: RAG_OS project structure, data sources (openseespy 218 pages,
opsvis 65 pages), 5-stage pipeline (crawl→normalize→chunk→index→retrieve), hybrid
FTS+FAISS retrieval with reranking, per-agent integration table (GeometryCodeTranslator
3 queries, CompleteCodeGenerator 4 queries), env var reference, build CLI commands,
GitHub hosting recommendation, optional sentence-transformers upgrade path.

TOC updated in both EN and CN documents.
Regenerated EN (64.4 KB) and CN (61.7 KB) Word docs.

Co-Authored-By: Claude Sonnet 4.6 <noreply@anthropic.com>
</commit_message>
<xml_diff>
--- a/MultiAgent_Architecture_Report.docx
+++ b/MultiAgent_Architecture_Report.docx
@@ -288,6 +288,17 @@
           <w:sz w:val="21"/>
         </w:rPr>
         <w:t xml:space="preserve">   4.7 分层式Agent LLM配置系统 (Updated v2.3)</w:t>
+      </w:r>
+    </w:p>
+    <w:p>
+      <w:pPr>
+        <w:spacing w:after="40"/>
+      </w:pPr>
+      <w:r>
+        <w:rPr>
+          <w:sz w:val="21"/>
+        </w:rPr>
+        <w:t xml:space="preserve">   4.8 RAG知识库集成 (RAG Knowledge Base Integration)</w:t>
       </w:r>
     </w:p>
     <w:p>
@@ -8329,6 +8340,953 @@
         <w:br/>
         <w:br/>
         <w:t>将任意字段留空即可回退到服务器环境默认值（DEEPSEEK_API_KEY / DEEPSEEK_MODEL / DEEPSEEK_BASE_URL）。点击"Save Config"将更改持久化到服务器。当层级覆写生效时，状态行会显示"N/3 tier(s) configured — overrides active"。</w:t>
+      </w:r>
+    </w:p>
+    <w:p>
+      <w:pPr>
+        <w:pStyle w:val="Heading2"/>
+      </w:pPr>
+      <w:r>
+        <w:t>4.8 RAG知识库集成 (RAG Knowledge Base Integration)</w:t>
+      </w:r>
+    </w:p>
+    <w:p>
+      <w:r>
+        <w:t>RAG（检索增强生成）集成模块将两个代码翻译Agent与本地离线知识库相结合，该知识库由官方OpenSeesPy和OpsVis文档抓取而来。启用后，检索到的文档片段会作为权威API约束预置到LLM提示词中，显著降低函数签名幻觉和错误参数使用问题。</w:t>
+      </w:r>
+    </w:p>
+    <w:p>
+      <w:pPr>
+        <w:pStyle w:val="Heading3"/>
+      </w:pPr>
+      <w:r>
+        <w:t>RAG_OS项目结构</w:t>
+      </w:r>
+    </w:p>
+    <w:p>
+      <w:r>
+        <w:t>RAG知识库是一个独立的Python项目，位于 H:\codex\RAG_OS（与multiagent代码库分开存放）。它抓取两个Read-the-Docs文档站点，将HTML标准化为结构化记录，按标题和代码块对内容进行分块，并构建混合检索索引。源代码独立托管于GitHub；预构建的数据工件（约4 MB）也一并提交，使系统无需重新爬取即可开箱即用。</w:t>
+      </w:r>
+    </w:p>
+    <w:p>
+      <w:pPr>
+        <w:pStyle w:val="Heading3"/>
+      </w:pPr>
+      <w:r>
+        <w:t>数据来源</w:t>
+      </w:r>
+    </w:p>
+    <w:tbl>
+      <w:tblPr>
+        <w:tblStyle w:val="LightGrid-Accent1"/>
+        <w:tblW w:type="auto" w:w="0"/>
+        <w:jc w:val="center"/>
+        <w:tblLook w:firstColumn="1" w:firstRow="1" w:lastColumn="0" w:lastRow="0" w:noHBand="0" w:noVBand="1" w:val="04A0"/>
+      </w:tblPr>
+      <w:tblGrid>
+        <w:gridCol w:w="2880"/>
+        <w:gridCol w:w="2880"/>
+        <w:gridCol w:w="2880"/>
+      </w:tblGrid>
+      <w:tr>
+        <w:tc>
+          <w:tcPr>
+            <w:tcW w:type="dxa" w:w="2880"/>
+          </w:tcPr>
+          <w:p>
+            <w:r>
+              <w:rPr>
+                <w:b/>
+                <w:sz w:val="18"/>
+              </w:rPr>
+              <w:t>来源</w:t>
+            </w:r>
+          </w:p>
+        </w:tc>
+        <w:tc>
+          <w:tcPr>
+            <w:tcW w:type="dxa" w:w="2880"/>
+          </w:tcPr>
+          <w:p>
+            <w:r>
+              <w:rPr>
+                <w:b/>
+                <w:sz w:val="18"/>
+              </w:rPr>
+              <w:t>文档站点</w:t>
+            </w:r>
+          </w:p>
+        </w:tc>
+        <w:tc>
+          <w:tcPr>
+            <w:tcW w:type="dxa" w:w="2880"/>
+          </w:tcPr>
+          <w:p>
+            <w:r>
+              <w:rPr>
+                <w:b/>
+                <w:sz w:val="18"/>
+              </w:rPr>
+              <w:t>内容</w:t>
+            </w:r>
+          </w:p>
+        </w:tc>
+      </w:tr>
+      <w:tr>
+        <w:tc>
+          <w:tcPr>
+            <w:tcW w:type="dxa" w:w="2880"/>
+          </w:tcPr>
+          <w:p>
+            <w:r>
+              <w:rPr>
+                <w:sz w:val="18"/>
+              </w:rPr>
+              <w:t>openseespy</w:t>
+            </w:r>
+          </w:p>
+        </w:tc>
+        <w:tc>
+          <w:tcPr>
+            <w:tcW w:type="dxa" w:w="2880"/>
+          </w:tcPr>
+          <w:p>
+            <w:r>
+              <w:rPr>
+                <w:sz w:val="18"/>
+              </w:rPr>
+              <w:t>openseespydoc.readthedocs.io</w:t>
+            </w:r>
+          </w:p>
+        </w:tc>
+        <w:tc>
+          <w:tcPr>
+            <w:tcW w:type="dxa" w:w="2880"/>
+          </w:tcPr>
+          <w:p>
+            <w:r>
+              <w:rPr>
+                <w:sz w:val="18"/>
+              </w:rPr>
+              <w:t>218个页面 — node、element、material、analysis及output API参考</w:t>
+            </w:r>
+          </w:p>
+        </w:tc>
+      </w:tr>
+      <w:tr>
+        <w:tc>
+          <w:tcPr>
+            <w:tcW w:type="dxa" w:w="2880"/>
+          </w:tcPr>
+          <w:p>
+            <w:r>
+              <w:rPr>
+                <w:sz w:val="18"/>
+              </w:rPr>
+              <w:t>opsvis</w:t>
+            </w:r>
+          </w:p>
+        </w:tc>
+        <w:tc>
+          <w:tcPr>
+            <w:tcW w:type="dxa" w:w="2880"/>
+          </w:tcPr>
+          <w:p>
+            <w:r>
+              <w:rPr>
+                <w:sz w:val="18"/>
+              </w:rPr>
+              <w:t>opsvis.readthedocs.io</w:t>
+            </w:r>
+          </w:p>
+        </w:tc>
+        <w:tc>
+          <w:tcPr>
+            <w:tcW w:type="dxa" w:w="2880"/>
+          </w:tcPr>
+          <w:p>
+            <w:r>
+              <w:rPr>
+                <w:sz w:val="18"/>
+              </w:rPr>
+              <w:t>65个页面 — plot_model、section_force_diagram_2d、plot_defo及动画示例</w:t>
+            </w:r>
+          </w:p>
+        </w:tc>
+      </w:tr>
+    </w:tbl>
+    <w:p>
+      <w:pPr>
+        <w:pStyle w:val="Heading3"/>
+      </w:pPr>
+      <w:r>
+        <w:t>架构：五阶段处理管线</w:t>
+      </w:r>
+    </w:p>
+    <w:tbl>
+      <w:tblPr>
+        <w:tblStyle w:val="LightGrid-Accent1"/>
+        <w:tblW w:type="auto" w:w="0"/>
+        <w:jc w:val="center"/>
+        <w:tblLook w:firstColumn="1" w:firstRow="1" w:lastColumn="0" w:lastRow="0" w:noHBand="0" w:noVBand="1" w:val="04A0"/>
+      </w:tblPr>
+      <w:tblGrid>
+        <w:gridCol w:w="2880"/>
+        <w:gridCol w:w="2880"/>
+        <w:gridCol w:w="2880"/>
+      </w:tblGrid>
+      <w:tr>
+        <w:tc>
+          <w:tcPr>
+            <w:tcW w:type="dxa" w:w="2880"/>
+          </w:tcPr>
+          <w:p>
+            <w:r>
+              <w:rPr>
+                <w:b/>
+                <w:sz w:val="18"/>
+              </w:rPr>
+              <w:t>阶段</w:t>
+            </w:r>
+          </w:p>
+        </w:tc>
+        <w:tc>
+          <w:tcPr>
+            <w:tcW w:type="dxa" w:w="2880"/>
+          </w:tcPr>
+          <w:p>
+            <w:r>
+              <w:rPr>
+                <w:b/>
+                <w:sz w:val="18"/>
+              </w:rPr>
+              <w:t>模块</w:t>
+            </w:r>
+          </w:p>
+        </w:tc>
+        <w:tc>
+          <w:tcPr>
+            <w:tcW w:type="dxa" w:w="2880"/>
+          </w:tcPr>
+          <w:p>
+            <w:r>
+              <w:rPr>
+                <w:b/>
+                <w:sz w:val="18"/>
+              </w:rPr>
+              <w:t>描述</w:t>
+            </w:r>
+          </w:p>
+        </w:tc>
+      </w:tr>
+      <w:tr>
+        <w:tc>
+          <w:tcPr>
+            <w:tcW w:type="dxa" w:w="2880"/>
+          </w:tcPr>
+          <w:p>
+            <w:r>
+              <w:rPr>
+                <w:sz w:val="18"/>
+              </w:rPr>
+              <w:t>抓取 (Crawl)</w:t>
+            </w:r>
+          </w:p>
+        </w:tc>
+        <w:tc>
+          <w:tcPr>
+            <w:tcW w:type="dxa" w:w="2880"/>
+          </w:tcPr>
+          <w:p>
+            <w:r>
+              <w:rPr>
+                <w:sz w:val="18"/>
+              </w:rPr>
+              <w:t>crawler.py</w:t>
+            </w:r>
+          </w:p>
+        </w:tc>
+        <w:tc>
+          <w:tcPr>
+            <w:tcW w:type="dxa" w:w="2880"/>
+          </w:tcPr>
+          <w:p>
+            <w:r>
+              <w:rPr>
+                <w:sz w:val="18"/>
+              </w:rPr>
+              <w:t>从允许的域名获取所有页面，遵守0.6秒爬取延迟，将原始HTML写入data/raw/</w:t>
+            </w:r>
+          </w:p>
+        </w:tc>
+      </w:tr>
+      <w:tr>
+        <w:tc>
+          <w:tcPr>
+            <w:tcW w:type="dxa" w:w="2880"/>
+          </w:tcPr>
+          <w:p>
+            <w:r>
+              <w:rPr>
+                <w:sz w:val="18"/>
+              </w:rPr>
+              <w:t>标准化 (Normalize)</w:t>
+            </w:r>
+          </w:p>
+        </w:tc>
+        <w:tc>
+          <w:tcPr>
+            <w:tcW w:type="dxa" w:w="2880"/>
+          </w:tcPr>
+          <w:p>
+            <w:r>
+              <w:rPr>
+                <w:sz w:val="18"/>
+              </w:rPr>
+              <w:t>normalize.py</w:t>
+            </w:r>
+          </w:p>
+        </w:tc>
+        <w:tc>
+          <w:tcPr>
+            <w:tcW w:type="dxa" w:w="2880"/>
+          </w:tcPr>
+          <w:p>
+            <w:r>
+              <w:rPr>
+                <w:sz w:val="18"/>
+              </w:rPr>
+              <w:t>将HTML转换为结构化记录：标题、URL、doc_type、章节、代码块 → data/normalized/*.jsonl</w:t>
+            </w:r>
+          </w:p>
+        </w:tc>
+      </w:tr>
+      <w:tr>
+        <w:tc>
+          <w:tcPr>
+            <w:tcW w:type="dxa" w:w="2880"/>
+          </w:tcPr>
+          <w:p>
+            <w:r>
+              <w:rPr>
+                <w:sz w:val="18"/>
+              </w:rPr>
+              <w:t>分块 (Chunk)</w:t>
+            </w:r>
+          </w:p>
+        </w:tc>
+        <w:tc>
+          <w:tcPr>
+            <w:tcW w:type="dxa" w:w="2880"/>
+          </w:tcPr>
+          <w:p>
+            <w:r>
+              <w:rPr>
+                <w:sz w:val="18"/>
+              </w:rPr>
+              <w:t>chunker.py</w:t>
+            </w:r>
+          </w:p>
+        </w:tc>
+        <w:tc>
+          <w:tcPr>
+            <w:tcW w:type="dxa" w:w="2880"/>
+          </w:tcPr>
+          <w:p>
+            <w:r>
+              <w:rPr>
+                <w:sz w:val="18"/>
+              </w:rPr>
+              <w:t>按标题边界和代码块将文档分割为检索友好的片段 → data/chunks/*.jsonl</w:t>
+            </w:r>
+          </w:p>
+        </w:tc>
+      </w:tr>
+      <w:tr>
+        <w:tc>
+          <w:tcPr>
+            <w:tcW w:type="dxa" w:w="2880"/>
+          </w:tcPr>
+          <w:p>
+            <w:r>
+              <w:rPr>
+                <w:sz w:val="18"/>
+              </w:rPr>
+              <w:t>索引 (Index)</w:t>
+            </w:r>
+          </w:p>
+        </w:tc>
+        <w:tc>
+          <w:tcPr>
+            <w:tcW w:type="dxa" w:w="2880"/>
+          </w:tcPr>
+          <w:p>
+            <w:r>
+              <w:rPr>
+                <w:sz w:val="18"/>
+              </w:rPr>
+              <w:t>indexer.py</w:t>
+            </w:r>
+          </w:p>
+        </w:tc>
+        <w:tc>
+          <w:tcPr>
+            <w:tcW w:type="dxa" w:w="2880"/>
+          </w:tcPr>
+          <w:p>
+            <w:r>
+              <w:rPr>
+                <w:sz w:val="18"/>
+              </w:rPr>
+              <w:t>构建SQLite FTS（BM25）索引和可选的基于哈希嵌入的FAISS向量索引 → data/indexes/</w:t>
+            </w:r>
+          </w:p>
+        </w:tc>
+      </w:tr>
+      <w:tr>
+        <w:tc>
+          <w:tcPr>
+            <w:tcW w:type="dxa" w:w="2880"/>
+          </w:tcPr>
+          <w:p>
+            <w:r>
+              <w:rPr>
+                <w:sz w:val="18"/>
+              </w:rPr>
+              <w:t>检索 (Retrieve)</w:t>
+            </w:r>
+          </w:p>
+        </w:tc>
+        <w:tc>
+          <w:tcPr>
+            <w:tcW w:type="dxa" w:w="2880"/>
+          </w:tcPr>
+          <w:p>
+            <w:r>
+              <w:rPr>
+                <w:sz w:val="18"/>
+              </w:rPr>
+              <w:t>retrieve.py</w:t>
+            </w:r>
+          </w:p>
+        </w:tc>
+        <w:tc>
+          <w:tcPr>
+            <w:tcW w:type="dxa" w:w="2880"/>
+          </w:tcPr>
+          <w:p>
+            <w:r>
+              <w:rPr>
+                <w:sz w:val="18"/>
+              </w:rPr>
+              <w:t>混合查询：FTS + FAISS → 按API文档类型加分、标题匹配、来源过滤重新排序</w:t>
+            </w:r>
+          </w:p>
+        </w:tc>
+      </w:tr>
+    </w:tbl>
+    <w:p>
+      <w:pPr>
+        <w:pStyle w:val="Heading3"/>
+      </w:pPr>
+      <w:r>
+        <w:t>混合检索策略</w:t>
+      </w:r>
+    </w:p>
+    <w:p>
+      <w:r>
+        <w:t>每个查询并行运行两路检索：SQLite FTS全文检索（BM25评分）和FAISS近似最近邻向量检索（哈希嵌入，可升级为sentence-transformers）。结果合并、去重后按以下评分函数重排序：</w:t>
+        <w:br/>
+        <w:t>• API类型文档（doc_type == "api"）：+20分</w:t>
+        <w:br/>
+        <w:t>• 匹配来源过滤器：+18分</w:t>
+        <w:br/>
+        <w:t>• 标题中包含精确查询词：+30分</w:t>
+        <w:br/>
+        <w:t>• 下载/源码dump类型：−30分</w:t>
+        <w:br/>
+        <w:t>得分最高的top_k个片段（默认3个）被格式化为"Retrieved Documentation Context"块，在每个Agent的任务描述前注入。</w:t>
+      </w:r>
+    </w:p>
+    <w:p>
+      <w:pPr>
+        <w:pStyle w:val="Heading3"/>
+      </w:pPr>
+      <w:r>
+        <w:t>Agent集成方式</w:t>
+      </w:r>
+    </w:p>
+    <w:tbl>
+      <w:tblPr>
+        <w:tblStyle w:val="LightGrid-Accent1"/>
+        <w:tblW w:type="auto" w:w="0"/>
+        <w:jc w:val="center"/>
+        <w:tblLook w:firstColumn="1" w:firstRow="1" w:lastColumn="0" w:lastRow="0" w:noHBand="0" w:noVBand="1" w:val="04A0"/>
+      </w:tblPr>
+      <w:tblGrid>
+        <w:gridCol w:w="2880"/>
+        <w:gridCol w:w="2880"/>
+        <w:gridCol w:w="2880"/>
+      </w:tblGrid>
+      <w:tr>
+        <w:tc>
+          <w:tcPr>
+            <w:tcW w:type="dxa" w:w="2880"/>
+          </w:tcPr>
+          <w:p>
+            <w:r>
+              <w:rPr>
+                <w:b/>
+                <w:sz w:val="18"/>
+              </w:rPr>
+              <w:t>Agent</w:t>
+            </w:r>
+          </w:p>
+        </w:tc>
+        <w:tc>
+          <w:tcPr>
+            <w:tcW w:type="dxa" w:w="2880"/>
+          </w:tcPr>
+          <w:p>
+            <w:r>
+              <w:rPr>
+                <w:b/>
+                <w:sz w:val="18"/>
+              </w:rPr>
+              <w:t>发出的查询数</w:t>
+            </w:r>
+          </w:p>
+        </w:tc>
+        <w:tc>
+          <w:tcPr>
+            <w:tcW w:type="dxa" w:w="2880"/>
+          </w:tcPr>
+          <w:p>
+            <w:r>
+              <w:rPr>
+                <w:b/>
+                <w:sz w:val="18"/>
+              </w:rPr>
+              <w:t>用途</w:t>
+            </w:r>
+          </w:p>
+        </w:tc>
+      </w:tr>
+      <w:tr>
+        <w:tc>
+          <w:tcPr>
+            <w:tcW w:type="dxa" w:w="2880"/>
+          </w:tcPr>
+          <w:p>
+            <w:r>
+              <w:rPr>
+                <w:sz w:val="18"/>
+              </w:rPr>
+              <w:t>GeometryCodeTranslator</w:t>
+            </w:r>
+          </w:p>
+        </w:tc>
+        <w:tc>
+          <w:tcPr>
+            <w:tcW w:type="dxa" w:w="2880"/>
+          </w:tcPr>
+          <w:p>
+            <w:r>
+              <w:rPr>
+                <w:sz w:val="18"/>
+              </w:rPr>
+              <w:t>3个查询（openseespy）</w:t>
+            </w:r>
+          </w:p>
+        </w:tc>
+        <w:tc>
+          <w:tcPr>
+            <w:tcW w:type="dxa" w:w="2880"/>
+          </w:tcPr>
+          <w:p>
+            <w:r>
+              <w:rPr>
+                <w:sz w:val="18"/>
+              </w:rPr>
+              <w:t>ndm/ndf/node/fix/geomTransf/Linear；elasticBeamColumn 2D语法A E Iz；节点坐标与边界条件</w:t>
+            </w:r>
+          </w:p>
+        </w:tc>
+      </w:tr>
+      <w:tr>
+        <w:tc>
+          <w:tcPr>
+            <w:tcW w:type="dxa" w:w="2880"/>
+          </w:tcPr>
+          <w:p>
+            <w:r>
+              <w:rPr>
+                <w:sz w:val="18"/>
+              </w:rPr>
+              <w:t>CompleteCodeGenerator</w:t>
+            </w:r>
+          </w:p>
+        </w:tc>
+        <w:tc>
+          <w:tcPr>
+            <w:tcW w:type="dxa" w:w="2880"/>
+          </w:tcPr>
+          <w:p>
+            <w:r>
+              <w:rPr>
+                <w:sz w:val="18"/>
+              </w:rPr>
+              <w:t>4个查询（openseespy×3，opsvis×1）</w:t>
+            </w:r>
+          </w:p>
+        </w:tc>
+        <w:tc>
+          <w:tcPr>
+            <w:tcW w:type="dxa" w:w="2880"/>
+          </w:tcPr>
+          <w:p>
+            <w:r>
+              <w:rPr>
+                <w:sz w:val="18"/>
+              </w:rPr>
+              <w:t>timeSeries/pattern/eleLoad；静力分析system/numberer/constraints；nodeDisp/nodeReaction/localForces；section_force_diagram_2d用法</w:t>
+            </w:r>
+          </w:p>
+        </w:tc>
+      </w:tr>
+    </w:tbl>
+    <w:p>
+      <w:r>
+        <w:t>ProblemAnalysisAgent、ConstructionPlanningAgent、NodeAgent、ElementAgent、LoadAssignmentAgent和PythonCheckAgent不查询RAG知识库——它们的任务涉及结构解释和代码诊断，而非OpenSeesPy API调用。</w:t>
+      </w:r>
+    </w:p>
+    <w:p>
+      <w:pPr>
+        <w:pStyle w:val="Heading3"/>
+      </w:pPr>
+      <w:r>
+        <w:t>环境变量配置</w:t>
+      </w:r>
+    </w:p>
+    <w:tbl>
+      <w:tblPr>
+        <w:tblStyle w:val="LightGrid-Accent1"/>
+        <w:tblW w:type="auto" w:w="0"/>
+        <w:jc w:val="center"/>
+        <w:tblLook w:firstColumn="1" w:firstRow="1" w:lastColumn="0" w:lastRow="0" w:noHBand="0" w:noVBand="1" w:val="04A0"/>
+      </w:tblPr>
+      <w:tblGrid>
+        <w:gridCol w:w="2880"/>
+        <w:gridCol w:w="2880"/>
+        <w:gridCol w:w="2880"/>
+      </w:tblGrid>
+      <w:tr>
+        <w:tc>
+          <w:tcPr>
+            <w:tcW w:type="dxa" w:w="2880"/>
+          </w:tcPr>
+          <w:p>
+            <w:r>
+              <w:rPr>
+                <w:b/>
+                <w:sz w:val="18"/>
+              </w:rPr>
+              <w:t>变量名</w:t>
+            </w:r>
+          </w:p>
+        </w:tc>
+        <w:tc>
+          <w:tcPr>
+            <w:tcW w:type="dxa" w:w="2880"/>
+          </w:tcPr>
+          <w:p>
+            <w:r>
+              <w:rPr>
+                <w:b/>
+                <w:sz w:val="18"/>
+              </w:rPr>
+              <w:t>默认值</w:t>
+            </w:r>
+          </w:p>
+        </w:tc>
+        <w:tc>
+          <w:tcPr>
+            <w:tcW w:type="dxa" w:w="2880"/>
+          </w:tcPr>
+          <w:p>
+            <w:r>
+              <w:rPr>
+                <w:b/>
+                <w:sz w:val="18"/>
+              </w:rPr>
+              <w:t>说明</w:t>
+            </w:r>
+          </w:p>
+        </w:tc>
+      </w:tr>
+      <w:tr>
+        <w:tc>
+          <w:tcPr>
+            <w:tcW w:type="dxa" w:w="2880"/>
+          </w:tcPr>
+          <w:p>
+            <w:r>
+              <w:rPr>
+                <w:sz w:val="18"/>
+              </w:rPr>
+              <w:t>RAG_OS_ROOT</w:t>
+            </w:r>
+          </w:p>
+        </w:tc>
+        <w:tc>
+          <w:tcPr>
+            <w:tcW w:type="dxa" w:w="2880"/>
+          </w:tcPr>
+          <w:p>
+            <w:r>
+              <w:rPr>
+                <w:sz w:val="18"/>
+              </w:rPr>
+              <w:t>H:\codex\RAG_OS</w:t>
+            </w:r>
+          </w:p>
+        </w:tc>
+        <w:tc>
+          <w:tcPr>
+            <w:tcW w:type="dxa" w:w="2880"/>
+          </w:tcPr>
+          <w:p>
+            <w:r>
+              <w:rPr>
+                <w:sz w:val="18"/>
+              </w:rPr>
+              <w:t>RAG_OS项目目录的绝对路径</w:t>
+            </w:r>
+          </w:p>
+        </w:tc>
+      </w:tr>
+      <w:tr>
+        <w:tc>
+          <w:tcPr>
+            <w:tcW w:type="dxa" w:w="2880"/>
+          </w:tcPr>
+          <w:p>
+            <w:r>
+              <w:rPr>
+                <w:sz w:val="18"/>
+              </w:rPr>
+              <w:t>MULTIAGENT_RAG_ENABLED</w:t>
+            </w:r>
+          </w:p>
+        </w:tc>
+        <w:tc>
+          <w:tcPr>
+            <w:tcW w:type="dxa" w:w="2880"/>
+          </w:tcPr>
+          <w:p>
+            <w:r>
+              <w:rPr>
+                <w:sz w:val="18"/>
+              </w:rPr>
+              <w:t>true</w:t>
+            </w:r>
+          </w:p>
+        </w:tc>
+        <w:tc>
+          <w:tcPr>
+            <w:tcW w:type="dxa" w:w="2880"/>
+          </w:tcPr>
+          <w:p>
+            <w:r>
+              <w:rPr>
+                <w:sz w:val="18"/>
+              </w:rPr>
+              <w:t>设为"false"可全局禁用RAG（Agent将在无文档上下文的情况下运行）</w:t>
+            </w:r>
+          </w:p>
+        </w:tc>
+      </w:tr>
+      <w:tr>
+        <w:tc>
+          <w:tcPr>
+            <w:tcW w:type="dxa" w:w="2880"/>
+          </w:tcPr>
+          <w:p>
+            <w:r>
+              <w:rPr>
+                <w:sz w:val="18"/>
+              </w:rPr>
+              <w:t>MULTIAGENT_RAG_TOP_K</w:t>
+            </w:r>
+          </w:p>
+        </w:tc>
+        <w:tc>
+          <w:tcPr>
+            <w:tcW w:type="dxa" w:w="2880"/>
+          </w:tcPr>
+          <w:p>
+            <w:r>
+              <w:rPr>
+                <w:sz w:val="18"/>
+              </w:rPr>
+              <w:t>3</w:t>
+            </w:r>
+          </w:p>
+        </w:tc>
+        <w:tc>
+          <w:tcPr>
+            <w:tcW w:type="dxa" w:w="2880"/>
+          </w:tcPr>
+          <w:p>
+            <w:r>
+              <w:rPr>
+                <w:sz w:val="18"/>
+              </w:rPr>
+              <w:t>每个查询检索的文档片段数量</w:t>
+            </w:r>
+          </w:p>
+        </w:tc>
+      </w:tr>
+      <w:tr>
+        <w:tc>
+          <w:tcPr>
+            <w:tcW w:type="dxa" w:w="2880"/>
+          </w:tcPr>
+          <w:p>
+            <w:r>
+              <w:rPr>
+                <w:sz w:val="18"/>
+              </w:rPr>
+              <w:t>MULTIAGENT_RAG_MAX_CHARS</w:t>
+            </w:r>
+          </w:p>
+        </w:tc>
+        <w:tc>
+          <w:tcPr>
+            <w:tcW w:type="dxa" w:w="2880"/>
+          </w:tcPr>
+          <w:p>
+            <w:r>
+              <w:rPr>
+                <w:sz w:val="18"/>
+              </w:rPr>
+              <w:t>6000</w:t>
+            </w:r>
+          </w:p>
+        </w:tc>
+        <w:tc>
+          <w:tcPr>
+            <w:tcW w:type="dxa" w:w="2880"/>
+          </w:tcPr>
+          <w:p>
+            <w:r>
+              <w:rPr>
+                <w:sz w:val="18"/>
+              </w:rPr>
+              <w:t>注入的RAG上下文最大字符数（超出则截断）</w:t>
+            </w:r>
+          </w:p>
+        </w:tc>
+      </w:tr>
+    </w:tbl>
+    <w:p>
+      <w:pPr>
+        <w:pStyle w:val="Heading3"/>
+      </w:pPr>
+      <w:r>
+        <w:t>构建知识库</w:t>
+      </w:r>
+    </w:p>
+    <w:p>
+      <w:r>
+        <w:t>运行以下命令可从头构建所有索引（需要网络访问以爬取文档站点）：</w:t>
+      </w:r>
+    </w:p>
+    <w:p>
+      <w:pPr>
+        <w:spacing w:before="80" w:after="80"/>
+      </w:pPr>
+      <w:r>
+        <w:rPr>
+          <w:rFonts w:ascii="Consolas" w:hAnsi="Consolas"/>
+          <w:sz w:val="18"/>
+        </w:rPr>
+        <w:t>cd H:\codex\RAG_OS</w:t>
+        <w:br/>
+        <w:t>pip install -r requirements.txt</w:t>
+        <w:br/>
+        <w:br/>
+        <w:t># 一键完整构建：</w:t>
+        <w:br/>
+        <w:t>python -m rag_os.cli build</w:t>
+        <w:br/>
+        <w:br/>
+        <w:t># 或分步执行：</w:t>
+        <w:br/>
+        <w:t>python -m rag_os.cli init        # 创建目录结构</w:t>
+        <w:br/>
+        <w:t>python -m rag_os.cli crawl       # 抓取约280个文档页面</w:t>
+        <w:br/>
+        <w:t>python -m rag_os.cli normalize   # HTML → 结构化JSONL记录</w:t>
+        <w:br/>
+        <w:t>python -m rag_os.cli chunk       # 段落级分块</w:t>
+        <w:br/>
+        <w:t>python -m rag_os.cli index       # 构建SQLite FTS + FAISS索引</w:t>
+        <w:br/>
+        <w:t>python -m rag_os.cli split-index # 可选：按来源构建独立索引</w:t>
+      </w:r>
+    </w:p>
+    <w:p>
+      <w:r>
+        <w:t>通过以下命令直接测试检索质量：</w:t>
+      </w:r>
+    </w:p>
+    <w:p>
+      <w:pPr>
+        <w:spacing w:before="80" w:after="80"/>
+      </w:pPr>
+      <w:r>
+        <w:rPr>
+          <w:rFonts w:ascii="Consolas" w:hAnsi="Consolas"/>
+          <w:sz w:val="18"/>
+        </w:rPr>
+        <w:t>python -m rag_os.cli query "How do I define an elasticBeamColumn in OpenSeesPy?"</w:t>
+        <w:br/>
+        <w:t>python -m rag_os.cli query "section_force_diagram_2d" --source opsvis</w:t>
+      </w:r>
+    </w:p>
+    <w:p>
+      <w:pPr>
+        <w:pStyle w:val="Heading3"/>
+      </w:pPr>
+      <w:r>
+        <w:t>GitHub托管建议</w:t>
+      </w:r>
+    </w:p>
+    <w:p>
+      <w:r>
+        <w:t>RAG_OS项目应作为独立GitHub仓库托管（不放在multiagent仓库内），因为它是一个独立的可复用组件。推荐结构：</w:t>
+        <w:br/>
+        <w:t>• 新建"RAG_OS"仓库，推送 H:\codex\RAG_OS（源代码 + 预构建数据工件）</w:t>
+        <w:br/>
+        <w:t>• 添加.gitignore，排除__pycache__、*.egg-info、*.pyc</w:t>
+        <w:br/>
+        <w:t>• 在multiagent仓库的README.md中说明路径，并相应设置RAG_OS_ROOT</w:t>
+        <w:br/>
+        <w:t>预构建数据（约4 MB：2个JSONL分块文件 + SQLite数据库 + FAISS索引）体积足够小，可直接提交，用户克隆后无需重新爬取即可运行。</w:t>
+      </w:r>
+    </w:p>
+    <w:p>
+      <w:pPr>
+        <w:pStyle w:val="Heading3"/>
+      </w:pPr>
+      <w:r>
+        <w:t>可选：更强的向量嵌入</w:t>
+      </w:r>
+    </w:p>
+    <w:p>
+      <w:r>
+        <w:t>默认FAISS索引使用确定性Token哈希嵌入，可在无ML模型的情况下离线运行。若希望提升对改述查询的召回率，可安装sentence-transformers并修改indexer.py中的嵌入函数，检索管线其余部分保持不变。</w:t>
       </w:r>
     </w:p>
     <w:p>

</xml_diff>